<commit_message>
docs: correct project designation to NLP Case Study 2
</commit_message>
<xml_diff>
--- a/reports/Implementation_Report_23MID0429.docx
+++ b/reports/Implementation_Report_23MID0429.docx
@@ -43,7 +43,7 @@
           <w:color w:val="2563EB"/>
           <w:sz w:val="24"/>
         </w:rPr>
-        <w:t>CASE STUDY 1 — QUESTION NUMBER 29</w:t>
+        <w:t>CASE STUDY 2</w:t>
       </w:r>
     </w:p>
     <w:p>
@@ -66,7 +66,7 @@
         <w:br/>
         <w:t>Hybrid Transformer-Based Information Retrieval</w:t>
         <w:br/>
-        <w:t>and Question Answering System</w:t>
+        <w:t>and Question Answering</w:t>
       </w:r>
     </w:p>
     <w:p>
@@ -212,7 +212,7 @@
                 <w:color w:val="0F172A"/>
                 <w:sz w:val="21"/>
               </w:rPr>
-              <w:t>CSI4001: Natural Language Processing</w:t>
+              <w:t>CSI4001: Natural Language Processing and Computational Linguistics</w:t>
             </w:r>
           </w:p>
         </w:tc>
@@ -236,7 +236,7 @@
                 <w:color w:val="334155"/>
                 <w:sz w:val="21"/>
               </w:rPr>
-              <w:t>Assessment &amp; Topic</w:t>
+              <w:t>Case Study &amp; Topic</w:t>
             </w:r>
           </w:p>
         </w:tc>
@@ -256,7 +256,7 @@
                 <w:color w:val="0F172A"/>
                 <w:sz w:val="21"/>
               </w:rPr>
-              <w:t>Case Study 1, Q29: Hybrid IR &amp; Question Answering</w:t>
+              <w:t>Case Study 2: Hybrid Transformer-Based Information Retrieval and Question Answering</w:t>
             </w:r>
           </w:p>
         </w:tc>

</xml_diff>